<commit_message>
docs: CLAUDE-3 catalog sync for wave 78 — register PHASE_8C_INTEGRATION + PHASE_8C_EXIT_GATE_EVIDENCE; CHANGELOG + README doc-map; regenerate exports; docs_chain verify in-sync
- .docs_chain/contexts/tracked_docs.yaml: track the two new Phase-8C docs
  (HXC-1614 docs/architecture/PHASE_8C_INTEGRATION.md, HXC-1613
  docs/PHASE_8C_EXIT_GATE_EVIDENCE.md) — md -> html/pdf/docx derive edges.
- CHANGELOG.md: wave-78 Added entry (4 streams + containers SELinux relabel fix).
- README.md: documentation map links the two new Phase-8C docs (§11.4.57).
- docs/export/*: regenerated html/pdf/docx for the new + changed docs.
- docs_chain sync --all then verify --all => in-sync (evidence qa-results/docs_chain/).

Co-Authored-By: Claude Opus 4.8 <noreply@anthropic.com>
</commit_message>
<xml_diff>
--- a/docs/export/README.docx
+++ b/docs/export/README.docx
@@ -10,7 +10,7 @@
         <w:t xml:space="preserve">README</w:t>
       </w:r>
     </w:p>
-    <w:bookmarkStart w:id="38" w:name="helix-cluster-os"/>
+    <w:bookmarkStart w:id="40" w:name="helix-cluster-os"/>
     <w:p>
       <w:pPr>
         <w:pStyle w:val="Heading1"/>
@@ -3433,7 +3433,7 @@
       </w:r>
     </w:p>
     <w:bookmarkEnd w:id="18"/>
-    <w:bookmarkStart w:id="33" w:name="documentation"/>
+    <w:bookmarkStart w:id="35" w:name="documentation"/>
     <w:p>
       <w:pPr>
         <w:pStyle w:val="Heading2"/>
@@ -3701,6 +3701,52 @@
           <w:rPr>
             <w:rStyle w:val="VerbatimChar"/>
           </w:rPr>
+          <w:t xml:space="preserve">docs/architecture/PHASE_8C_INTEGRATION.md</w:t>
+        </w:r>
+      </w:hyperlink>
+      <w:r>
+        <w:t xml:space="preserve"> </w:t>
+      </w:r>
+      <w:r>
+        <w:t xml:space="preserve">— code-grounded Phase 8C integration map: attestation→scheduler, e2ee→orchestrator, marketplace seams (implemented vs PLANNED) (HXC-1614)</w:t>
+      </w:r>
+    </w:p>
+    <w:p>
+      <w:pPr>
+        <w:pStyle w:val="Compact"/>
+        <w:numPr>
+          <w:ilvl w:val="0"/>
+          <w:numId w:val="1004"/>
+        </w:numPr>
+      </w:pPr>
+      <w:hyperlink r:id="rId28">
+        <w:r>
+          <w:rPr>
+            <w:rStyle w:val="VerbatimChar"/>
+          </w:rPr>
+          <w:t xml:space="preserve">docs/PHASE_8C_EXIT_GATE_EVIDENCE.md</w:t>
+        </w:r>
+      </w:hyperlink>
+      <w:r>
+        <w:t xml:space="preserve"> </w:t>
+      </w:r>
+      <w:r>
+        <w:t xml:space="preserve">— Phase 8C CLAUDE-1 exit-gate evidence matrix (PROVEN / PARTIAL / NOT-YET, each row tied to a real test or a Queued ticket) (HXC-1613)</w:t>
+      </w:r>
+    </w:p>
+    <w:p>
+      <w:pPr>
+        <w:pStyle w:val="Compact"/>
+        <w:numPr>
+          <w:ilvl w:val="0"/>
+          <w:numId w:val="1004"/>
+        </w:numPr>
+      </w:pPr>
+      <w:hyperlink r:id="rId29">
+        <w:r>
+          <w:rPr>
+            <w:rStyle w:val="VerbatimChar"/>
+          </w:rPr>
           <w:t xml:space="preserve">CODING_STANDARDS_GO.md</w:t>
         </w:r>
       </w:hyperlink>
@@ -3713,7 +3759,7 @@
       <w:r>
         <w:t xml:space="preserve"> </w:t>
       </w:r>
-      <w:hyperlink r:id="rId28">
+      <w:hyperlink r:id="rId30">
         <w:r>
           <w:rPr>
             <w:rStyle w:val="VerbatimChar"/>
@@ -3730,7 +3776,7 @@
       <w:r>
         <w:t xml:space="preserve"> </w:t>
       </w:r>
-      <w:hyperlink r:id="rId29">
+      <w:hyperlink r:id="rId31">
         <w:r>
           <w:rPr>
             <w:rStyle w:val="VerbatimChar"/>
@@ -3753,7 +3799,7 @@
           <w:numId w:val="1004"/>
         </w:numPr>
       </w:pPr>
-      <w:hyperlink r:id="rId30">
+      <w:hyperlink r:id="rId32">
         <w:r>
           <w:rPr>
             <w:rStyle w:val="VerbatimChar"/>
@@ -3776,7 +3822,7 @@
           <w:numId w:val="1004"/>
         </w:numPr>
       </w:pPr>
-      <w:hyperlink r:id="rId31">
+      <w:hyperlink r:id="rId33">
         <w:r>
           <w:rPr>
             <w:rStyle w:val="VerbatimChar"/>
@@ -3791,7 +3837,7 @@
         <w:t xml:space="preserve">— release history</w:t>
       </w:r>
     </w:p>
-    <w:bookmarkStart w:id="32" w:name="X31176231b28ba5be0f37bf2e74baf59aaa3f3d3"/>
+    <w:bookmarkStart w:id="34" w:name="X31176231b28ba5be0f37bf2e74baf59aaa3f3d3"/>
     <w:p>
       <w:pPr>
         <w:pStyle w:val="Heading3"/>
@@ -3866,9 +3912,9 @@
         <w:t xml:space="preserve">, with no escape hatch. The mandate restates and cites Constitution §11.4.106 and the project rules CLAUDE-3 / AGENT-2 / QWEN-2.</w:t>
       </w:r>
     </w:p>
-    <w:bookmarkEnd w:id="32"/>
-    <w:bookmarkEnd w:id="33"/>
-    <w:bookmarkStart w:id="34" w:name="development-model"/>
+    <w:bookmarkEnd w:id="34"/>
+    <w:bookmarkEnd w:id="35"/>
+    <w:bookmarkStart w:id="36" w:name="development-model"/>
     <w:p>
       <w:pPr>
         <w:pStyle w:val="Heading2"/>
@@ -3969,8 +4015,8 @@
         <w:t xml:space="preserve">tests, and an independent mutation bite per item that must fail the item’s named guard test. No item is marked Completed without that proof.</w:t>
       </w:r>
     </w:p>
-    <w:bookmarkEnd w:id="34"/>
-    <w:bookmarkStart w:id="35" w:name="contributing"/>
+    <w:bookmarkEnd w:id="36"/>
+    <w:bookmarkStart w:id="37" w:name="contributing"/>
     <w:p>
       <w:pPr>
         <w:pStyle w:val="Heading2"/>
@@ -4036,8 +4082,8 @@
         <w:t xml:space="preserve">Commit and open a Pull Request</w:t>
       </w:r>
     </w:p>
-    <w:bookmarkEnd w:id="35"/>
-    <w:bookmarkStart w:id="37" w:name="license"/>
+    <w:bookmarkEnd w:id="37"/>
+    <w:bookmarkStart w:id="39" w:name="license"/>
     <w:p>
       <w:pPr>
         <w:pStyle w:val="Heading2"/>
@@ -4056,7 +4102,7 @@
       <w:r>
         <w:t xml:space="preserve"> </w:t>
       </w:r>
-      <w:hyperlink r:id="rId36">
+      <w:hyperlink r:id="rId38">
         <w:r>
           <w:rPr>
             <w:rStyle w:val="Hyperlink"/>
@@ -4071,8 +4117,8 @@
         <w:t xml:space="preserve">for details.</w:t>
       </w:r>
     </w:p>
-    <w:bookmarkEnd w:id="37"/>
-    <w:bookmarkEnd w:id="38"/>
+    <w:bookmarkEnd w:id="39"/>
+    <w:bookmarkEnd w:id="40"/>
     <w:sectPr>
       <w:footnotePr>
         <w:numRestart w:val="eachSect"/>

</xml_diff>